<commit_message>
with 100 convergence and explanation
</commit_message>
<xml_diff>
--- a/Report.docx
+++ b/Report.docx
@@ -4,7 +4,31 @@
   <w:body>
     <w:p>
       <w:r>
-        <w:t>Team Members: Patriel Stapleton and Helen Radomski</w:t>
+        <w:t xml:space="preserve">Team Members: </w:t>
+      </w:r>
+      <w:proofErr w:type="spellStart"/>
+      <w:r>
+        <w:t>Patriel</w:t>
+      </w:r>
+      <w:proofErr w:type="spellEnd"/>
+      <w:r>
+        <w:t xml:space="preserve"> Stapleton and Helen Radomski</w:t>
+      </w:r>
+    </w:p>
+    <w:p/>
+    <w:p>
+      <w:pPr>
+        <w:rPr>
+          <w:b/>
+          <w:bCs/>
+        </w:rPr>
+      </w:pPr>
+      <w:r>
+        <w:rPr>
+          <w:b/>
+          <w:bCs/>
+        </w:rPr>
+        <w:t xml:space="preserve">Gossip Algorithm </w:t>
       </w:r>
     </w:p>
     <w:p>
@@ -81,7 +105,7 @@
                     <pic:cNvPicPr/>
                   </pic:nvPicPr>
                   <pic:blipFill>
-                    <a:blip r:embed="rId5">
+                    <a:blip r:embed="rId4">
                       <a:extLst>
                         <a:ext uri="{28A0092B-C50C-407E-A947-70E740481C1C}">
                           <a14:useLocalDpi xmlns:a14="http://schemas.microsoft.com/office/drawing/2010/main" val="0"/>
@@ -158,13 +182,13 @@
         <w:t xml:space="preserve"> if</w:t>
       </w:r>
       <w:r>
-        <w:t xml:space="preserve"> the first actor chosen </w:t>
-      </w:r>
-      <w:r>
-        <w:t xml:space="preserve">was </w:t>
-      </w:r>
-      <w:r>
-        <w:t>a</w:t>
+        <w:t xml:space="preserve"> the first actor chosen w</w:t>
+      </w:r>
+      <w:r>
+        <w:t>ere</w:t>
+      </w:r>
+      <w:r>
+        <w:t xml:space="preserve">  a</w:t>
       </w:r>
       <w:r>
         <w:rPr>
@@ -223,7 +247,11 @@
         <w:t>.</w:t>
       </w:r>
       <w:r>
-        <w:t xml:space="preserve"> The success of this topology can be pictured as a ripple effect, where activity stems from the activation point and spreads in every direction. There are multiple paths between nodes, so they are less likely to become isolated.</w:t>
+        <w:t xml:space="preserve"> The success of this topology can be pictured as a ripple effect, where activity stems from the </w:t>
+      </w:r>
+      <w:r>
+        <w:lastRenderedPageBreak/>
+        <w:t>activation point and spreads in every direction. There are multiple paths between nodes, so they are less likely to become isolated.</w:t>
       </w:r>
       <w:r>
         <w:t xml:space="preserve"> </w:t>
@@ -256,25 +284,92 @@
         <w:t xml:space="preserve">. </w:t>
       </w:r>
       <w:r>
-        <w:t xml:space="preserve">This </w:t>
-      </w:r>
-      <w:r>
-        <w:lastRenderedPageBreak/>
-        <w:t>makes sense, as a random actor activated somewhere else in the topology could trigger activation for a number of actors that would otherwise have to wait for growth to spread node by node.</w:t>
+        <w:t>This makes sense, as a random actor activated somewhere else in the topology could trigger activation for a number of actors that would otherwise have to wait for growth to spread node by node.</w:t>
       </w:r>
     </w:p>
     <w:p>
       <w:r>
-        <w:t xml:space="preserve">The full topology performed well in small tests, but </w:t>
-      </w:r>
-      <w:r>
-        <w:t>the duration to convergence</w:t>
-      </w:r>
-      <w:r>
-        <w:t xml:space="preserve"> grew rapidly at higher values of n. This makes sense, as small topologies still allow each node a high chance of being selected for a message. At higher values of n, with only one active node at the start, each </w:t>
+        <w:t xml:space="preserve">The full topology performed well in small tests, but times for it grew rapidly at higher values of n. This makes sense, as small topologies still allow each node a high chance of being selected for a message. At higher values of n, with only one active node at the start, each </w:t>
       </w:r>
       <w:r>
         <w:t>inactive node has a very small chance of becoming activated. As a result, growth moves slowly.</w:t>
+      </w:r>
+    </w:p>
+    <w:p/>
+    <w:p>
+      <w:r>
+        <w:t>The following plot shows the results of the gossip algorithm run with 100% convergence threshold. Above n=1,000, results were highly variable. Below this range, it is too small to detect the difference in performance between 3D, imperfect 3D, and full topologies.</w:t>
+      </w:r>
+    </w:p>
+    <w:p>
+      <w:r>
+        <w:rPr>
+          <w:noProof/>
+        </w:rPr>
+        <w:drawing>
+          <wp:inline distT="0" distB="0" distL="0" distR="0" wp14:anchorId="77570DE7" wp14:editId="21278A59">
+            <wp:extent cx="4385310" cy="3288983"/>
+            <wp:effectExtent l="0" t="0" r="0" b="6985"/>
+            <wp:docPr id="1615273209" name="Picture 1" descr="A graph with a green line and red line&#10;&#10;AI-generated content may be incorrect."/>
+            <wp:cNvGraphicFramePr>
+              <a:graphicFrameLocks xmlns:a="http://schemas.openxmlformats.org/drawingml/2006/main" noChangeAspect="1"/>
+            </wp:cNvGraphicFramePr>
+            <a:graphic xmlns:a="http://schemas.openxmlformats.org/drawingml/2006/main">
+              <a:graphicData uri="http://schemas.openxmlformats.org/drawingml/2006/picture">
+                <pic:pic xmlns:pic="http://schemas.openxmlformats.org/drawingml/2006/picture">
+                  <pic:nvPicPr>
+                    <pic:cNvPr id="1615273209" name="Picture 1" descr="A graph with a green line and red line&#10;&#10;AI-generated content may be incorrect."/>
+                    <pic:cNvPicPr/>
+                  </pic:nvPicPr>
+                  <pic:blipFill>
+                    <a:blip r:embed="rId5">
+                      <a:extLst>
+                        <a:ext uri="{28A0092B-C50C-407E-A947-70E740481C1C}">
+                          <a14:useLocalDpi xmlns:a14="http://schemas.microsoft.com/office/drawing/2010/main" val="0"/>
+                        </a:ext>
+                      </a:extLst>
+                    </a:blip>
+                    <a:stretch>
+                      <a:fillRect/>
+                    </a:stretch>
+                  </pic:blipFill>
+                  <pic:spPr>
+                    <a:xfrm>
+                      <a:off x="0" y="0"/>
+                      <a:ext cx="4387564" cy="3290673"/>
+                    </a:xfrm>
+                    <a:prstGeom prst="rect">
+                      <a:avLst/>
+                    </a:prstGeom>
+                  </pic:spPr>
+                </pic:pic>
+              </a:graphicData>
+            </a:graphic>
+          </wp:inline>
+        </w:drawing>
+      </w:r>
+    </w:p>
+    <w:p/>
+    <w:p/>
+    <w:p/>
+    <w:p/>
+    <w:p/>
+    <w:p/>
+    <w:p/>
+    <w:p>
+      <w:pPr>
+        <w:rPr>
+          <w:b/>
+          <w:bCs/>
+        </w:rPr>
+      </w:pPr>
+      <w:r>
+        <w:rPr>
+          <w:b/>
+          <w:bCs/>
+        </w:rPr>
+        <w:lastRenderedPageBreak/>
+        <w:t>Push-Sum Algorithm</w:t>
       </w:r>
     </w:p>
     <w:p>
@@ -359,13 +454,7 @@
         <w:t xml:space="preserve"> will happen.</w:t>
       </w:r>
       <w:r>
-        <w:t xml:space="preserve"> All tests run with line topology for values higher than 100 showed good growth initially, but eventually reached a stalling point. We suspect this is because with such high values of n</w:t>
-      </w:r>
-      <w:r>
-        <w:t>,</w:t>
-      </w:r>
-      <w:r>
-        <w:t xml:space="preserve"> it becomes extremely likely that somewhere along the line a node becomes inactive too soon, choking its neighbors and stopping progress.</w:t>
+        <w:t xml:space="preserve"> All tests run with line topology for values higher than 100 showed good growth initially, but eventually reached a stalling point. We suspect this is because with such high values of n it becomes extremely likely that somewhere along the line a node becomes inactive too soon, choking its neighbors and stopping progress.</w:t>
       </w:r>
     </w:p>
     <w:p>
@@ -376,29 +465,19 @@
         <w:t>e push-sum</w:t>
       </w:r>
       <w:r>
-        <w:t xml:space="preserve"> algorithm</w:t>
-      </w:r>
-      <w:r>
-        <w:t>,</w:t>
-      </w:r>
-      <w:r>
-        <w:t xml:space="preserve"> we can see that full topology performs well at small n, but takes off after n=1,000. </w:t>
-      </w:r>
-      <w:r>
-        <w:t>Similar to what we observed in the gossip algorithm, a</w:t>
-      </w:r>
-      <w:r>
-        <w:t xml:space="preserve"> node must experience consistency for 3 rounds to count as having reached convergence, but if it happens too early, it loses the chance of activating other nodes, a crucial step</w:t>
+        <w:t xml:space="preserve"> algorithm we can see that full topology performs well at small n, but takes off after n=1,000. </w:t>
+      </w:r>
+      <w:r>
+        <w:t>A similar reasoning applied in the gossip algorithm applies here too</w:t>
+      </w:r>
+      <w:r>
+        <w:t>. A node must experience consistency for 3 rounds to count as having reached convergence, but if it happens too early, it loses the chance of activating other nodes, a crucial step</w:t>
       </w:r>
       <w:r>
         <w:t xml:space="preserve"> in reaching full convergence</w:t>
       </w:r>
       <w:r>
-        <w:t xml:space="preserve">. In a fully connected topology, it is more likely that a node could be activated at random and remain </w:t>
-      </w:r>
-      <w:r>
-        <w:lastRenderedPageBreak/>
-        <w:t>untouched for 3 rounds, leading to deactivation. Unlike the linear topology, however, this does not lead to stalling. Inactive nodes can always be activated by any other node</w:t>
+        <w:t>. In a fully connected topology, it is more likely that a node could be activated at random, and remain untouched for 3 rounds, leading to deactivation. Unlike the linear topology, however, this does not lead to stalling. Inactive nodes can always be activated by any other node</w:t>
       </w:r>
       <w:r>
         <w:t>;</w:t>
@@ -412,7 +491,11 @@
         <w:t>Lastly, we have the 3D and imperfect 3D algorithms, which both performed well in push-sum, as expected. Again, the imperfect model can be seen to perform slightly better than the perfect 3D</w:t>
       </w:r>
       <w:r>
-        <w:t>, for the same reason</w:t>
+        <w:t xml:space="preserve">, for </w:t>
+      </w:r>
+      <w:r>
+        <w:lastRenderedPageBreak/>
+        <w:t>the same reason</w:t>
       </w:r>
       <w:r>
         <w:t>.</w:t>
@@ -434,6 +517,116 @@
       </w:r>
     </w:p>
     <w:p/>
+    <w:p>
+      <w:r>
+        <w:t xml:space="preserve">The following plot shows the push-sum performance at the 100% convergence threshold. In this case, performance was only reliable up to n=100. For n=1,000, the algorithm consistently reached convergence of ~99.97-99.99 before reaching a stalling point in each topology (excluding line, which performed more poorly). </w:t>
+      </w:r>
+    </w:p>
+    <w:p>
+      <w:r>
+        <w:rPr>
+          <w:noProof/>
+        </w:rPr>
+        <w:drawing>
+          <wp:inline distT="0" distB="0" distL="0" distR="0" wp14:anchorId="6E9185DC" wp14:editId="5E165343">
+            <wp:extent cx="4827693" cy="3620770"/>
+            <wp:effectExtent l="0" t="0" r="0" b="0"/>
+            <wp:docPr id="696548509" name="Picture 2" descr="A graph of a number of nodes&#10;&#10;AI-generated content may be incorrect."/>
+            <wp:cNvGraphicFramePr>
+              <a:graphicFrameLocks xmlns:a="http://schemas.openxmlformats.org/drawingml/2006/main" noChangeAspect="1"/>
+            </wp:cNvGraphicFramePr>
+            <a:graphic xmlns:a="http://schemas.openxmlformats.org/drawingml/2006/main">
+              <a:graphicData uri="http://schemas.openxmlformats.org/drawingml/2006/picture">
+                <pic:pic xmlns:pic="http://schemas.openxmlformats.org/drawingml/2006/picture">
+                  <pic:nvPicPr>
+                    <pic:cNvPr id="696548509" name="Picture 2" descr="A graph of a number of nodes&#10;&#10;AI-generated content may be incorrect."/>
+                    <pic:cNvPicPr/>
+                  </pic:nvPicPr>
+                  <pic:blipFill>
+                    <a:blip r:embed="rId7">
+                      <a:extLst>
+                        <a:ext uri="{28A0092B-C50C-407E-A947-70E740481C1C}">
+                          <a14:useLocalDpi xmlns:a14="http://schemas.microsoft.com/office/drawing/2010/main" val="0"/>
+                        </a:ext>
+                      </a:extLst>
+                    </a:blip>
+                    <a:stretch>
+                      <a:fillRect/>
+                    </a:stretch>
+                  </pic:blipFill>
+                  <pic:spPr>
+                    <a:xfrm>
+                      <a:off x="0" y="0"/>
+                      <a:ext cx="4830537" cy="3622903"/>
+                    </a:xfrm>
+                    <a:prstGeom prst="rect">
+                      <a:avLst/>
+                    </a:prstGeom>
+                  </pic:spPr>
+                </pic:pic>
+              </a:graphicData>
+            </a:graphic>
+          </wp:inline>
+        </w:drawing>
+      </w:r>
+    </w:p>
+    <w:p>
+      <w:r>
+        <w:t>It is understandable that perfect convergence is harder to achieve under the push-sum algorithm than the gossip algorithm, as nodes may become deactivated after just 3 rounds of inactivity, without having activated all of their neighbors (as opposed to the 10-message threshold in the gossip model). Consider, for example, a node ‘a’ in the line topology, with two neighbors. One neighbor is active and has activated node ‘a’</w:t>
+      </w:r>
+      <w:r>
+        <w:t>; the other neighbor is not yet active</w:t>
+      </w:r>
+      <w:r>
+        <w:t xml:space="preserve">. Each round, the </w:t>
+      </w:r>
+      <w:r>
+        <w:t xml:space="preserve">active </w:t>
+      </w:r>
+      <w:r>
+        <w:t>neighbor has a 50% chance of sending a message to node ‘a’</w:t>
+      </w:r>
+      <w:r>
+        <w:t>. T</w:t>
+      </w:r>
+      <w:r>
+        <w:t xml:space="preserve">hus, </w:t>
+      </w:r>
+      <w:r>
+        <w:t xml:space="preserve">node ‘a’ </w:t>
+      </w:r>
+      <w:r>
+        <w:t>has an expected lifetime of 20 rounds before deactivating (10*1/p). However, in the push-sum algorithm, the odds of receiving no message for 3 rounds in a row lead to an expected lifetime of 14 rounds ([1-(1-p)^3]/[p*(1-p)^3]). In both algorithms, the likelihood that node ‘a’ activates its other neighbor</w:t>
+      </w:r>
+      <w:r>
+        <w:t xml:space="preserve"> at each round</w:t>
+      </w:r>
+      <w:r>
+        <w:t xml:space="preserve"> is the same. Therefore, because there is a shorter expected lifetime under the push-sum calculation, it is more likely that node ‘a’ will deactivate before activating its other neighbor</w:t>
+      </w:r>
+      <w:r>
+        <w:t xml:space="preserve"> in push-sum than in gossip</w:t>
+      </w:r>
+      <w:r>
+        <w:t xml:space="preserve">. </w:t>
+      </w:r>
+      <w:r>
+        <w:t>If such a situation occurs</w:t>
+      </w:r>
+      <w:r>
+        <w:t>, the other neighbor has no chance of activation and full convergence will never be achieved.</w:t>
+      </w:r>
+      <w:r>
+        <w:t xml:space="preserve"> </w:t>
+      </w:r>
+      <w:r>
+        <w:t xml:space="preserve">In other topologies, the probabilities become much more complicated, as nodes could have any number of active and inactive neighbors, but </w:t>
+      </w:r>
+      <w:r>
+        <w:lastRenderedPageBreak/>
+        <w:t>performance seems to suggest that push-sum is overall less likely to produce 100% convergence than gossip, especially at higher values of n.</w:t>
+      </w:r>
+    </w:p>
     <w:p/>
     <w:sectPr>
       <w:pgSz w:w="12240" w:h="15840"/>
@@ -443,10 +636,6 @@
     </w:sectPr>
   </w:body>
 </w:document>
-</file>
-
-<file path=word/numbering.xml><?xml version="1.0" encoding="utf-8"?>
-<w:numbering xmlns:wpc="http://schemas.microsoft.com/office/word/2010/wordprocessingCanvas" xmlns:cx="http://schemas.microsoft.com/office/drawing/2014/chartex" xmlns:cx1="http://schemas.microsoft.com/office/drawing/2015/9/8/chartex" xmlns:cx2="http://schemas.microsoft.com/office/drawing/2015/10/21/chartex" xmlns:cx3="http://schemas.microsoft.com/office/drawing/2016/5/9/chartex" xmlns:cx4="http://schemas.microsoft.com/office/drawing/2016/5/10/chartex" xmlns:cx5="http://schemas.microsoft.com/office/drawing/2016/5/11/chartex" xmlns:cx6="http://schemas.microsoft.com/office/drawing/2016/5/12/chartex" xmlns:cx7="http://schemas.microsoft.com/office/drawing/2016/5/13/chartex" xmlns:cx8="http://schemas.microsoft.com/office/drawing/2016/5/14/chartex" xmlns:mc="http://schemas.openxmlformats.org/markup-compatibility/2006" xmlns:aink="http://schemas.microsoft.com/office/drawing/2016/ink" xmlns:am3d="http://schemas.microsoft.com/office/drawing/2017/model3d" xmlns:o="urn:schemas-microsoft-com:office:office" xmlns:oel="http://schemas.microsoft.com/office/2019/extlst" xmlns:r="http://schemas.openxmlformats.org/officeDocument/2006/relationships" xmlns:m="http://schemas.openxmlformats.org/officeDocument/2006/math" xmlns:v="urn:schemas-microsoft-com:vml" xmlns:wp14="http://schemas.microsoft.com/office/word/2010/wordprocessingDrawing" xmlns:wp="http://schemas.openxmlformats.org/drawingml/2006/wordprocessingDrawing" xmlns:w10="urn:schemas-microsoft-com:office:word" xmlns:w="http://schemas.openxmlformats.org/wordprocessingml/2006/main" xmlns:w14="http://schemas.microsoft.com/office/word/2010/wordml" xmlns:w15="http://schemas.microsoft.com/office/word/2012/wordml" xmlns:w16cex="http://schemas.microsoft.com/office/word/2018/wordml/cex" xmlns:w16cid="http://schemas.microsoft.com/office/word/2016/wordml/cid" xmlns:w16="http://schemas.microsoft.com/office/word/2018/wordml" xmlns:w16du="http://schemas.microsoft.com/office/word/2023/wordml/word16du" xmlns:w16sdtdh="http://schemas.microsoft.com/office/word/2020/wordml/sdtdatahash" xmlns:w16sdtfl="http://schemas.microsoft.com/office/word/2024/wordml/sdtformatlock" xmlns:w16se="http://schemas.microsoft.com/office/word/2015/wordml/symex" xmlns:wpg="http://schemas.microsoft.com/office/word/2010/wordprocessingGroup" xmlns:wpi="http://schemas.microsoft.com/office/word/2010/wordprocessingInk" xmlns:wne="http://schemas.microsoft.com/office/word/2006/wordml" xmlns:wps="http://schemas.microsoft.com/office/word/2010/wordprocessingShape" mc:Ignorable="w14 w15 w16se w16cid w16 w16cex w16sdtdh w16sdtfl w16du wp14"/>
 </file>
 
 <file path=word/styles.xml><?xml version="1.0" encoding="utf-8"?>

</xml_diff>

<commit_message>
added tests i ran
</commit_message>
<xml_diff>
--- a/Report.docx
+++ b/Report.docx
@@ -3,19 +3,20 @@
 <w:document xmlns:wpc="http://schemas.microsoft.com/office/word/2010/wordprocessingCanvas" xmlns:cx="http://schemas.microsoft.com/office/drawing/2014/chartex" xmlns:cx1="http://schemas.microsoft.com/office/drawing/2015/9/8/chartex" xmlns:cx2="http://schemas.microsoft.com/office/drawing/2015/10/21/chartex" xmlns:cx3="http://schemas.microsoft.com/office/drawing/2016/5/9/chartex" xmlns:cx4="http://schemas.microsoft.com/office/drawing/2016/5/10/chartex" xmlns:cx5="http://schemas.microsoft.com/office/drawing/2016/5/11/chartex" xmlns:cx6="http://schemas.microsoft.com/office/drawing/2016/5/12/chartex" xmlns:cx7="http://schemas.microsoft.com/office/drawing/2016/5/13/chartex" xmlns:cx8="http://schemas.microsoft.com/office/drawing/2016/5/14/chartex" xmlns:mc="http://schemas.openxmlformats.org/markup-compatibility/2006" xmlns:aink="http://schemas.microsoft.com/office/drawing/2016/ink" xmlns:am3d="http://schemas.microsoft.com/office/drawing/2017/model3d" xmlns:o="urn:schemas-microsoft-com:office:office" xmlns:oel="http://schemas.microsoft.com/office/2019/extlst" xmlns:r="http://schemas.openxmlformats.org/officeDocument/2006/relationships" xmlns:m="http://schemas.openxmlformats.org/officeDocument/2006/math" xmlns:v="urn:schemas-microsoft-com:vml" xmlns:wp14="http://schemas.microsoft.com/office/word/2010/wordprocessingDrawing" xmlns:wp="http://schemas.openxmlformats.org/drawingml/2006/wordprocessingDrawing" xmlns:w10="urn:schemas-microsoft-com:office:word" xmlns:w="http://schemas.openxmlformats.org/wordprocessingml/2006/main" xmlns:w14="http://schemas.microsoft.com/office/word/2010/wordml" xmlns:w15="http://schemas.microsoft.com/office/word/2012/wordml" xmlns:w16cex="http://schemas.microsoft.com/office/word/2018/wordml/cex" xmlns:w16cid="http://schemas.microsoft.com/office/word/2016/wordml/cid" xmlns:w16="http://schemas.microsoft.com/office/word/2018/wordml" xmlns:w16du="http://schemas.microsoft.com/office/word/2023/wordml/word16du" xmlns:w16sdtdh="http://schemas.microsoft.com/office/word/2020/wordml/sdtdatahash" xmlns:w16sdtfl="http://schemas.microsoft.com/office/word/2024/wordml/sdtformatlock" xmlns:w16se="http://schemas.microsoft.com/office/word/2015/wordml/symex" xmlns:wpg="http://schemas.microsoft.com/office/word/2010/wordprocessingGroup" xmlns:wpi="http://schemas.microsoft.com/office/word/2010/wordprocessingInk" xmlns:wne="http://schemas.microsoft.com/office/word/2006/wordml" xmlns:wps="http://schemas.microsoft.com/office/word/2010/wordprocessingShape" mc:Ignorable="w14 w15 w16se w16cid w16 w16cex w16sdtdh w16sdtfl w16du wp14">
   <w:body>
     <w:p>
-      <w:r>
-        <w:t xml:space="preserve">Team Members: </w:t>
-      </w:r>
-      <w:proofErr w:type="spellStart"/>
-      <w:r>
-        <w:t>Patriel</w:t>
-      </w:r>
-      <w:proofErr w:type="spellEnd"/>
-      <w:r>
-        <w:t xml:space="preserve"> Stapleton and Helen Radomski</w:t>
+      <w:pPr>
+        <w:rPr>
+          <w:sz w:val="28"/>
+          <w:szCs w:val="28"/>
+        </w:rPr>
+      </w:pPr>
+      <w:r>
+        <w:rPr>
+          <w:sz w:val="28"/>
+          <w:szCs w:val="28"/>
+        </w:rPr>
+        <w:t>Team Members: Patriel Stapleton and Helen Radomski</w:t>
       </w:r>
     </w:p>
-    <w:p/>
     <w:p>
       <w:pPr>
         <w:rPr>
@@ -33,13 +34,40 @@
     </w:p>
     <w:p>
       <w:r>
-        <w:t>Due to randomness, there is a possibility of certain nodes never becoming activated</w:t>
-      </w:r>
-      <w:r>
-        <w:t xml:space="preserve"> or never receiving the required 10 messages</w:t>
-      </w:r>
-      <w:r>
-        <w:t>. To address this, we applied a threshold of 95% convergence to our testing. As</w:t>
+        <w:t xml:space="preserve">Due to randomness, there is a possibility </w:t>
+      </w:r>
+      <w:r>
+        <w:t xml:space="preserve">that some </w:t>
+      </w:r>
+      <w:r>
+        <w:t xml:space="preserve">nodes </w:t>
+      </w:r>
+      <w:r>
+        <w:t>will never become activated or never receive</w:t>
+      </w:r>
+      <w:r>
+        <w:t xml:space="preserve"> the required 10 messages</w:t>
+      </w:r>
+      <w:r>
+        <w:t xml:space="preserve">. </w:t>
+      </w:r>
+      <w:r>
+        <w:t xml:space="preserve">This </w:t>
+      </w:r>
+      <w:r>
+        <w:t xml:space="preserve">was most apparent with the line topology. </w:t>
+      </w:r>
+      <w:r>
+        <w:t xml:space="preserve">To address this, we applied a threshold of 95% convergence </w:t>
+      </w:r>
+      <w:r>
+        <w:t xml:space="preserve">to the graph below </w:t>
+      </w:r>
+      <w:r>
+        <w:t>to keep the threshold the same for all topologies</w:t>
+      </w:r>
+      <w:r>
+        <w:t>. As</w:t>
       </w:r>
       <w:r>
         <w:t xml:space="preserve"> such, convergence was reache</w:t>
@@ -63,28 +91,25 @@
         <w:t xml:space="preserve"> </w:t>
       </w:r>
       <w:r>
+        <w:t xml:space="preserve">We also chart the </w:t>
+      </w:r>
+      <w:r>
+        <w:t xml:space="preserve">performance </w:t>
+      </w:r>
+      <w:r>
+        <w:t>at 100% convergence later in the section</w:t>
+      </w:r>
+      <w:r>
+        <w:t>.</w:t>
+      </w:r>
+      <w:r>
         <w:t xml:space="preserve"> </w:t>
-      </w:r>
-      <w:r>
-        <w:t xml:space="preserve">This was bounded by the highest number we could reach for the </w:t>
-      </w:r>
-      <w:r>
-        <w:t>topologies, the lowest being the line topology for both algorithms</w:t>
-      </w:r>
-      <w:r>
-        <w:t>.</w:t>
-      </w:r>
-      <w:r>
-        <w:t xml:space="preserve"> We ran </w:t>
-      </w:r>
-      <w:r>
-        <w:t xml:space="preserve">gossip </w:t>
-      </w:r>
-      <w:r>
-        <w:t>tests for n values of (10, 100, 1_000, 10_000) for full, 3D, and imperfect 3D topologies and (10, 100, 1_000) for line topology.</w:t>
       </w:r>
     </w:p>
     <w:p>
+      <w:pPr>
+        <w:jc w:val="center"/>
+      </w:pPr>
       <w:r>
         <w:rPr>
           <w:noProof/>
@@ -105,7 +130,7 @@
                     <pic:cNvPicPr/>
                   </pic:nvPicPr>
                   <pic:blipFill>
-                    <a:blip r:embed="rId4">
+                    <a:blip r:embed="rId5">
                       <a:extLst>
                         <a:ext uri="{28A0092B-C50C-407E-A947-70E740481C1C}">
                           <a14:useLocalDpi xmlns:a14="http://schemas.microsoft.com/office/drawing/2010/main" val="0"/>
@@ -143,7 +168,15 @@
         <w:t>most</w:t>
       </w:r>
       <w:r>
-        <w:t xml:space="preserve"> n values and was not able to finish for higher n values</w:t>
+        <w:t xml:space="preserve"> n values and </w:t>
+      </w:r>
+      <w:proofErr w:type="gramStart"/>
+      <w:r>
+        <w:t>was not able to</w:t>
+      </w:r>
+      <w:proofErr w:type="gramEnd"/>
+      <w:r>
+        <w:t xml:space="preserve"> finish for higher n values</w:t>
       </w:r>
       <w:r>
         <w:t xml:space="preserve">. We were able to deduce that this was due to the sparse neighborhood each actor had. Each time an actor received a message, it had a 50% chance of sending that message to a neighbor it had already messaged. This meant </w:t>
@@ -182,13 +215,13 @@
         <w:t xml:space="preserve"> if</w:t>
       </w:r>
       <w:r>
-        <w:t xml:space="preserve"> the first actor chosen w</w:t>
-      </w:r>
-      <w:r>
-        <w:t>ere</w:t>
-      </w:r>
-      <w:r>
-        <w:t xml:space="preserve">  a</w:t>
+        <w:t xml:space="preserve"> the first actor chosen </w:t>
+      </w:r>
+      <w:r>
+        <w:t xml:space="preserve">was </w:t>
+      </w:r>
+      <w:r>
+        <w:t>a</w:t>
       </w:r>
       <w:r>
         <w:rPr>
@@ -206,7 +239,25 @@
         <w:t>n</w:t>
       </w:r>
       <w:r>
-        <w:t>, and each actor would need to transmit to the neighbor they had not received from, except a</w:t>
+        <w:t xml:space="preserve">, and each </w:t>
+      </w:r>
+      <w:r>
+        <w:t xml:space="preserve">subsequent </w:t>
+      </w:r>
+      <w:r>
+        <w:t>actor would need to transmit to the neighbor they had not received from</w:t>
+      </w:r>
+      <w:r>
+        <w:t xml:space="preserve"> (</w:t>
+      </w:r>
+      <w:r>
+        <w:t>ex</w:t>
+      </w:r>
+      <w:r>
+        <w:t>cluding</w:t>
+      </w:r>
+      <w:r>
+        <w:t xml:space="preserve"> a</w:t>
       </w:r>
       <w:r>
         <w:rPr>
@@ -224,7 +275,10 @@
         <w:t>n</w:t>
       </w:r>
       <w:r>
-        <w:t xml:space="preserve">. </w:t>
+        <w:t>).</w:t>
+      </w:r>
+      <w:r>
+        <w:t xml:space="preserve"> </w:t>
       </w:r>
       <w:r>
         <w:t>Due to randomness and the narrow path to success for this topology, performance was extremely unreliable.</w:t>
@@ -247,23 +301,31 @@
         <w:t>.</w:t>
       </w:r>
       <w:r>
-        <w:t xml:space="preserve"> The success of this topology can be pictured as a ripple effect, where activity stems from the </w:t>
+        <w:t xml:space="preserve"> The success of this topology can be pictured as a ripple effect, where activity stems from the activation point and spreads in every direction. There are multiple paths between nodes, so they are less likely to become isolated.</w:t>
+      </w:r>
+      <w:r>
+        <w:t xml:space="preserve"> </w:t>
+      </w:r>
+      <w:r>
+        <w:t xml:space="preserve">Each newly activated node </w:t>
+      </w:r>
+      <w:proofErr w:type="gramStart"/>
+      <w:r>
+        <w:t>opens up</w:t>
+      </w:r>
+      <w:proofErr w:type="gramEnd"/>
+      <w:r>
+        <w:t xml:space="preserve"> </w:t>
+      </w:r>
+      <w:r>
+        <w:t xml:space="preserve">multiple </w:t>
+      </w:r>
+      <w:r>
+        <w:t xml:space="preserve">new options for </w:t>
       </w:r>
       <w:r>
         <w:lastRenderedPageBreak/>
-        <w:t>activation point and spreads in every direction. There are multiple paths between nodes, so they are less likely to become isolated.</w:t>
-      </w:r>
-      <w:r>
-        <w:t xml:space="preserve"> </w:t>
-      </w:r>
-      <w:r>
-        <w:t xml:space="preserve">Each newly activated node opens up </w:t>
-      </w:r>
-      <w:r>
-        <w:t xml:space="preserve">multiple </w:t>
-      </w:r>
-      <w:r>
-        <w:t xml:space="preserve">new options for future activations. </w:t>
+        <w:t xml:space="preserve">future activations. </w:t>
       </w:r>
       <w:r>
         <w:t>The i</w:t>
@@ -284,24 +346,147 @@
         <w:t xml:space="preserve">. </w:t>
       </w:r>
       <w:r>
-        <w:t>This makes sense, as a random actor activated somewhere else in the topology could trigger activation for a number of actors that would otherwise have to wait for growth to spread node by node.</w:t>
+        <w:t>We</w:t>
+      </w:r>
+      <w:r>
+        <w:t xml:space="preserve"> observed that this was because</w:t>
+      </w:r>
+      <w:r>
+        <w:t xml:space="preserve"> a random actor </w:t>
+      </w:r>
+      <w:r>
+        <w:t xml:space="preserve">would be </w:t>
+      </w:r>
+      <w:r>
+        <w:t>activated somewhere else in the topology</w:t>
+      </w:r>
+      <w:r>
+        <w:t xml:space="preserve">. Since our algorithm </w:t>
+      </w:r>
+      <w:r>
+        <w:t>ensured the random actor would be chosen from the set of all actors not in the current neighbor, t</w:t>
+      </w:r>
+      <w:r>
+        <w:t xml:space="preserve">his meant </w:t>
+      </w:r>
+      <w:r>
+        <w:t xml:space="preserve">that if the random actor was selected, it would </w:t>
+      </w:r>
+      <w:r>
+        <w:t xml:space="preserve">trigger activation for </w:t>
+      </w:r>
+      <w:proofErr w:type="gramStart"/>
+      <w:r>
+        <w:t>a number of</w:t>
+      </w:r>
+      <w:proofErr w:type="gramEnd"/>
+      <w:r>
+        <w:t xml:space="preserve"> actors that would otherwise have to wait for growth to spread node by node.</w:t>
       </w:r>
     </w:p>
     <w:p>
       <w:r>
-        <w:t xml:space="preserve">The full topology performed well in small tests, but times for it grew rapidly at higher values of n. This makes sense, as small topologies still allow each node a high chance of being selected for a message. At higher values of n, with only one active node at the start, each </w:t>
+        <w:t xml:space="preserve">The full topology performed well in small </w:t>
+      </w:r>
+      <w:proofErr w:type="gramStart"/>
+      <w:r>
+        <w:t>tests, but</w:t>
+      </w:r>
+      <w:proofErr w:type="gramEnd"/>
+      <w:r>
+        <w:t xml:space="preserve"> </w:t>
+      </w:r>
+      <w:r>
+        <w:t xml:space="preserve">degraded in time performance as the network size grew and N became larger. </w:t>
+      </w:r>
+      <w:r>
+        <w:t xml:space="preserve"> </w:t>
+      </w:r>
+      <w:r>
+        <w:t xml:space="preserve">We ascertained this was due to the </w:t>
+      </w:r>
+      <w:r>
+        <w:t>shrinking</w:t>
+      </w:r>
+      <w:r>
+        <w:t xml:space="preserve"> probability </w:t>
+      </w:r>
+      <w:r>
+        <w:t>of being selected as the neighborhood grew.</w:t>
+      </w:r>
+      <w:r>
+        <w:t xml:space="preserve"> </w:t>
+      </w:r>
+      <w:r>
+        <w:t>E</w:t>
+      </w:r>
+      <w:r>
+        <w:t>ach neighbor h</w:t>
+      </w:r>
+      <w:r>
+        <w:t xml:space="preserve">as </w:t>
+      </w:r>
+      <w:r>
+        <w:t>1/(n-1)</w:t>
+      </w:r>
+      <w:r>
+        <w:t xml:space="preserve"> probability of being selected. This performs well for small network</w:t>
+      </w:r>
+      <w:r>
+        <w:t>s</w:t>
+      </w:r>
+      <w:r>
+        <w:t>,</w:t>
+      </w:r>
+      <w:r>
+        <w:t xml:space="preserve"> </w:t>
+      </w:r>
+      <w:r>
+        <w:t>as the probability is higher that each node will eventually be selected</w:t>
+      </w:r>
+      <w:r>
+        <w:t xml:space="preserve">. At higher values of n, </w:t>
+      </w:r>
+      <w:r>
+        <w:t xml:space="preserve">this probability degrades </w:t>
+      </w:r>
+      <w:r>
+        <w:t xml:space="preserve">because the algorithm only selects </w:t>
+      </w:r>
+      <w:r>
+        <w:t>one active node at the start</w:t>
+      </w:r>
+      <w:r>
+        <w:t xml:space="preserve">; therefore, </w:t>
+      </w:r>
+      <w:r>
+        <w:t xml:space="preserve">each </w:t>
       </w:r>
       <w:r>
         <w:t>inactive node has a very small chance of becoming activated. As a result, growth moves slowly.</w:t>
-      </w:r>
-    </w:p>
-    <w:p/>
-    <w:p>
-      <w:r>
-        <w:t>The following plot shows the results of the gossip algorithm run with 100% convergence threshold. Above n=1,000, results were highly variable. Below this range, it is too small to detect the difference in performance between 3D, imperfect 3D, and full topologies.</w:t>
       </w:r>
     </w:p>
     <w:p>
+      <w:r>
+        <w:t xml:space="preserve">The following plot shows the results of the gossip algorithm run with </w:t>
+      </w:r>
+      <w:r>
+        <w:t xml:space="preserve">a </w:t>
+      </w:r>
+      <w:r>
+        <w:t>100% convergence threshold. Above n=1,000, results were highly variable</w:t>
+      </w:r>
+      <w:r>
+        <w:t xml:space="preserve"> due to the randomness of selection</w:t>
+      </w:r>
+      <w:r>
+        <w:t>. Below this range, it is too small to detect the difference in performance between 3D, imperfect 3D, and full topologies.</w:t>
+      </w:r>
+    </w:p>
+    <w:p>
+      <w:pPr>
+        <w:jc w:val="center"/>
+      </w:pPr>
       <w:r>
         <w:rPr>
           <w:noProof/>
@@ -322,7 +507,7 @@
                     <pic:cNvPicPr/>
                   </pic:nvPicPr>
                   <pic:blipFill>
-                    <a:blip r:embed="rId5">
+                    <a:blip r:embed="rId6">
                       <a:extLst>
                         <a:ext uri="{28A0092B-C50C-407E-A947-70E740481C1C}">
                           <a14:useLocalDpi xmlns:a14="http://schemas.microsoft.com/office/drawing/2010/main" val="0"/>
@@ -348,14 +533,10 @@
           </wp:inline>
         </w:drawing>
       </w:r>
+      <w:r>
+        <w:br w:type="page"/>
+      </w:r>
     </w:p>
-    <w:p/>
-    <w:p/>
-    <w:p/>
-    <w:p/>
-    <w:p/>
-    <w:p/>
-    <w:p/>
     <w:p>
       <w:pPr>
         <w:rPr>
@@ -380,10 +561,19 @@
         <w:t xml:space="preserve"> (or 90% for n=10)</w:t>
       </w:r>
       <w:r>
-        <w:t>. We used values (10, 100, 1_000, 10_000) for full, 3D and imperfect 3D topologies, but were only able to use (10, 100) for the line topology.</w:t>
+        <w:t>. We used values (10, 100, 1_000, 10_000) for full, 3D</w:t>
+      </w:r>
+      <w:r>
+        <w:t>,</w:t>
+      </w:r>
+      <w:r>
+        <w:t xml:space="preserve"> and imperfect 3D topologies, but were only able to use (10, 100) for the line topology.</w:t>
       </w:r>
     </w:p>
     <w:p>
+      <w:pPr>
+        <w:jc w:val="center"/>
+      </w:pPr>
       <w:r>
         <w:rPr>
           <w:noProof/>
@@ -404,7 +594,7 @@
                     <pic:cNvPicPr/>
                   </pic:nvPicPr>
                   <pic:blipFill>
-                    <a:blip r:embed="rId6">
+                    <a:blip r:embed="rId7">
                       <a:extLst>
                         <a:ext uri="{28A0092B-C50C-407E-A947-70E740481C1C}">
                           <a14:useLocalDpi xmlns:a14="http://schemas.microsoft.com/office/drawing/2010/main" val="0"/>
@@ -454,36 +644,218 @@
         <w:t xml:space="preserve"> will happen.</w:t>
       </w:r>
       <w:r>
-        <w:t xml:space="preserve"> All tests run with line topology for values higher than 100 showed good growth initially, but eventually reached a stalling point. We suspect this is because with such high values of n it becomes extremely likely that somewhere along the line a node becomes inactive too soon, choking its neighbors and stopping progress.</w:t>
+        <w:t xml:space="preserve"> All tests run with line topology for values higher than 100 showed good growth </w:t>
+      </w:r>
+      <w:proofErr w:type="gramStart"/>
+      <w:r>
+        <w:t>initially, but</w:t>
+      </w:r>
+      <w:proofErr w:type="gramEnd"/>
+      <w:r>
+        <w:t xml:space="preserve"> eventually reached a stalling point. We suspect </w:t>
+      </w:r>
+      <w:r>
+        <w:t>that due to the</w:t>
+      </w:r>
+      <w:r>
+        <w:t xml:space="preserve"> large network size and the </w:t>
+      </w:r>
+      <w:r>
+        <w:t>higher probability of a node becoming deactivated</w:t>
+      </w:r>
+      <w:r>
+        <w:t>, it</w:t>
+      </w:r>
+      <w:r>
+        <w:t xml:space="preserve"> becomes extremely likely that somewhere along the line</w:t>
+      </w:r>
+      <w:r>
+        <w:t>,</w:t>
+      </w:r>
+      <w:r>
+        <w:t xml:space="preserve"> a node becomes inactive too soon, choking its neighbors and stopping progress.</w:t>
+      </w:r>
+      <w:r>
+        <w:t xml:space="preserve"> We tested this by increasing the number of </w:t>
+      </w:r>
+      <w:r>
+        <w:t>rounds for which an actor at convergence would still transmit</w:t>
+      </w:r>
+      <w:r>
+        <w:t xml:space="preserve"> information</w:t>
+      </w:r>
+      <w:r>
+        <w:t>.</w:t>
+      </w:r>
+      <w:r>
+        <w:t xml:space="preserve"> </w:t>
+      </w:r>
+      <w:r>
+        <w:t>With this</w:t>
+      </w:r>
+      <w:r>
+        <w:t>,</w:t>
+      </w:r>
+      <w:r>
+        <w:t xml:space="preserve"> we </w:t>
+      </w:r>
+      <w:r>
+        <w:t>were able to double the network size</w:t>
+      </w:r>
+      <w:r>
+        <w:t xml:space="preserve"> </w:t>
+      </w:r>
+      <w:r>
+        <w:t xml:space="preserve">that </w:t>
+      </w:r>
+      <w:r>
+        <w:t xml:space="preserve">the line topology could support before </w:t>
+      </w:r>
+      <w:r>
+        <w:t>becoming stalled.</w:t>
+      </w:r>
+      <w:r>
+        <w:t xml:space="preserve"> </w:t>
+      </w:r>
+      <w:r>
+        <w:t>This suggests that for the push-sum algorithm, when using a sparse neighborhood, the higher the threshold for becoming inactive, the better the performance results.</w:t>
       </w:r>
     </w:p>
     <w:p>
       <w:r>
-        <w:t>Again, with th</w:t>
-      </w:r>
-      <w:r>
-        <w:t>e push-sum</w:t>
-      </w:r>
-      <w:r>
-        <w:t xml:space="preserve"> algorithm we can see that full topology performs well at small n, but takes off after n=1,000. </w:t>
-      </w:r>
-      <w:r>
-        <w:t>A similar reasoning applied in the gossip algorithm applies here too</w:t>
-      </w:r>
-      <w:r>
-        <w:t>. A node must experience consistency for 3 rounds to count as having reached convergence, but if it happens too early, it loses the chance of activating other nodes, a crucial step</w:t>
-      </w:r>
-      <w:r>
-        <w:t xml:space="preserve"> in reaching full convergence</w:t>
-      </w:r>
-      <w:r>
-        <w:t>. In a fully connected topology, it is more likely that a node could be activated at random, and remain untouched for 3 rounds, leading to deactivation. Unlike the linear topology, however, this does not lead to stalling. Inactive nodes can always be activated by any other node</w:t>
-      </w:r>
-      <w:r>
-        <w:t>;</w:t>
-      </w:r>
-      <w:r>
-        <w:t xml:space="preserve"> it just may take some time to be randomly selected.</w:t>
+        <w:t xml:space="preserve">Our observations for the full topology when </w:t>
+      </w:r>
+      <w:r>
+        <w:t xml:space="preserve">executing the gossip algorithm were </w:t>
+      </w:r>
+      <w:proofErr w:type="gramStart"/>
+      <w:r>
+        <w:t>similar to</w:t>
+      </w:r>
+      <w:proofErr w:type="gramEnd"/>
+      <w:r>
+        <w:t xml:space="preserve"> the push-sum algorithm</w:t>
+      </w:r>
+      <w:r>
+        <w:t xml:space="preserve">. </w:t>
+      </w:r>
+      <w:r>
+        <w:t xml:space="preserve"> </w:t>
+      </w:r>
+      <w:r>
+        <w:t xml:space="preserve">As outlined in the graph above, </w:t>
+      </w:r>
+      <w:r>
+        <w:t>the full topology</w:t>
+      </w:r>
+      <w:r>
+        <w:t xml:space="preserve"> </w:t>
+      </w:r>
+      <w:r>
+        <w:t xml:space="preserve">outperforms both </w:t>
+      </w:r>
+      <w:r>
+        <w:t>t</w:t>
+      </w:r>
+      <w:r>
+        <w:t>he 3D and imperfect 3D topologies</w:t>
+      </w:r>
+      <w:r>
+        <w:t xml:space="preserve"> after n=1,000. </w:t>
+      </w:r>
+      <w:r>
+        <w:t xml:space="preserve">This is due to the changing </w:t>
+      </w:r>
+      <w:proofErr w:type="gramStart"/>
+      <w:r>
+        <w:t>probabilities</w:t>
+      </w:r>
+      <w:proofErr w:type="gramEnd"/>
+      <w:r>
+        <w:t>. In the full topology</w:t>
+      </w:r>
+      <w:r>
+        <w:t>, it does not matter if a node becomes</w:t>
+      </w:r>
+      <w:r>
+        <w:t xml:space="preserve"> inactive </w:t>
+      </w:r>
+      <w:proofErr w:type="gramStart"/>
+      <w:r>
+        <w:t>early on in the</w:t>
+      </w:r>
+      <w:proofErr w:type="gramEnd"/>
+      <w:r>
+        <w:t xml:space="preserve"> </w:t>
+      </w:r>
+      <w:r>
+        <w:t>process because its neighbors still have a 1/(n-1) chance of becoming activated by another node</w:t>
+      </w:r>
+      <w:r>
+        <w:t>.</w:t>
+      </w:r>
+      <w:r>
+        <w:t xml:space="preserve"> </w:t>
+      </w:r>
+      <w:r>
+        <w:t xml:space="preserve">Since every </w:t>
+      </w:r>
+      <w:proofErr w:type="gramStart"/>
+      <w:r>
+        <w:t>node,</w:t>
+      </w:r>
+      <w:proofErr w:type="gramEnd"/>
+      <w:r>
+        <w:t xml:space="preserve"> is aware of every other </w:t>
+      </w:r>
+      <w:r>
+        <w:t xml:space="preserve">in </w:t>
+      </w:r>
+      <w:r>
+        <w:t>a fully connected topology</w:t>
+      </w:r>
+      <w:r>
+        <w:t xml:space="preserve">, a node becoming inactive </w:t>
+      </w:r>
+      <w:r>
+        <w:t xml:space="preserve">does not lead to stalling. </w:t>
+      </w:r>
+      <w:r>
+        <w:t xml:space="preserve">However, </w:t>
+      </w:r>
+      <w:r>
+        <w:lastRenderedPageBreak/>
+        <w:t>we realize this does come at a cost of time</w:t>
+      </w:r>
+      <w:r>
+        <w:t>.</w:t>
+      </w:r>
+      <w:r>
+        <w:t xml:space="preserve"> </w:t>
+      </w:r>
+      <w:r>
+        <w:t>S</w:t>
+      </w:r>
+      <w:r>
+        <w:t xml:space="preserve">ince </w:t>
+      </w:r>
+      <w:r>
+        <w:t>inactive nodes are not removed from an actor’s neighborhood</w:t>
+      </w:r>
+      <w:r>
+        <w:t xml:space="preserve">, they are just as likely to be selected and </w:t>
+      </w:r>
+      <w:r>
+        <w:t>may take some time to be selected.</w:t>
+      </w:r>
+      <w:r>
+        <w:t xml:space="preserve"> </w:t>
+      </w:r>
+      <w:r>
+        <w:t>This is simply one of the tradeoffs of the gossip protocol since</w:t>
+      </w:r>
+      <w:r>
+        <w:t xml:space="preserve"> no single node manages connections.</w:t>
       </w:r>
     </w:p>
     <w:p>
@@ -491,11 +863,7 @@
         <w:t>Lastly, we have the 3D and imperfect 3D algorithms, which both performed well in push-sum, as expected. Again, the imperfect model can be seen to perform slightly better than the perfect 3D</w:t>
       </w:r>
       <w:r>
-        <w:t xml:space="preserve">, for </w:t>
-      </w:r>
-      <w:r>
-        <w:lastRenderedPageBreak/>
-        <w:t>the same reason</w:t>
+        <w:t>, for the same reason</w:t>
       </w:r>
       <w:r>
         <w:t>.</w:t>
@@ -507,22 +875,30 @@
         <w:t>Overall, t</w:t>
       </w:r>
       <w:r>
-        <w:t xml:space="preserve">hese models perform even better than they did under the gossip algorithm. As a neighborhood of nodes becomes active, they will continue to stimulate each other, preventing deactivation until </w:t>
+        <w:t xml:space="preserve">hese models perform even better than they did under the gossip algorithm. </w:t>
+      </w:r>
+      <w:r>
+        <w:t xml:space="preserve">When we lowered the threshold for convergence in the gossip algorithm to 3, we saw a similar increase in time to convergence. </w:t>
+      </w:r>
+      <w:r>
+        <w:t xml:space="preserve">As a neighborhood of nodes becomes active, they will continue to stimulate each other, preventing deactivation until </w:t>
       </w:r>
       <w:r>
         <w:t xml:space="preserve">growth </w:t>
       </w:r>
       <w:r>
         <w:t>slows and convergence sets in all at once.</w:t>
-      </w:r>
-    </w:p>
-    <w:p/>
-    <w:p>
-      <w:r>
-        <w:t xml:space="preserve">The following plot shows the push-sum performance at the 100% convergence threshold. In this case, performance was only reliable up to n=100. For n=1,000, the algorithm consistently reached convergence of ~99.97-99.99 before reaching a stalling point in each topology (excluding line, which performed more poorly). </w:t>
       </w:r>
     </w:p>
     <w:p>
+      <w:r>
+        <w:t xml:space="preserve">The following plot shows the push-sum performance at the 100% convergence threshold. In this case, performance was only reliable up to n=100. For n=1,000, the algorithm consistently reached convergence of ~99.97-99.99 before reaching a stalling point in each topology (excluding line, which performed more poorly). </w:t>
+      </w:r>
+    </w:p>
+    <w:p>
+      <w:pPr>
+        <w:jc w:val="center"/>
+      </w:pPr>
       <w:r>
         <w:rPr>
           <w:noProof/>
@@ -543,7 +919,7 @@
                     <pic:cNvPicPr/>
                   </pic:nvPicPr>
                   <pic:blipFill>
-                    <a:blip r:embed="rId7">
+                    <a:blip r:embed="rId8">
                       <a:extLst>
                         <a:ext uri="{28A0092B-C50C-407E-A947-70E740481C1C}">
                           <a14:useLocalDpi xmlns:a14="http://schemas.microsoft.com/office/drawing/2010/main" val="0"/>
@@ -572,31 +948,32 @@
     </w:p>
     <w:p>
       <w:r>
-        <w:t>It is understandable that perfect convergence is harder to achieve under the push-sum algorithm than the gossip algorithm, as nodes may become deactivated after just 3 rounds of inactivity, without having activated all of their neighbors (as opposed to the 10-message threshold in the gossip model). Consider, for example, a node ‘a’ in the line topology, with two neighbors. One neighbor is active and has activated node ‘a’</w:t>
-      </w:r>
-      <w:r>
-        <w:t>; the other neighbor is not yet active</w:t>
-      </w:r>
-      <w:r>
-        <w:t xml:space="preserve">. Each round, the </w:t>
-      </w:r>
-      <w:r>
-        <w:t xml:space="preserve">active </w:t>
-      </w:r>
-      <w:r>
-        <w:t>neighbor has a 50% chance of sending a message to node ‘a’</w:t>
-      </w:r>
-      <w:r>
-        <w:t>. T</w:t>
-      </w:r>
-      <w:r>
-        <w:t xml:space="preserve">hus, </w:t>
-      </w:r>
-      <w:r>
-        <w:t xml:space="preserve">node ‘a’ </w:t>
-      </w:r>
-      <w:r>
-        <w:t>has an expected lifetime of 20 rounds before deactivating (10*1/p). However, in the push-sum algorithm, the odds of receiving no message for 3 rounds in a row lead to an expected lifetime of 14 rounds ([1-(1-p)^3]/[p*(1-p)^3]). In both algorithms, the likelihood that node ‘a’ activates its other neighbor</w:t>
+        <w:t xml:space="preserve">It is understandable that perfect convergence is harder to achieve under the push-sum algorithm than the gossip algorithm, as nodes may become deactivated after just 3 rounds of inactivity, without having activated </w:t>
+      </w:r>
+      <w:proofErr w:type="gramStart"/>
+      <w:r>
+        <w:t>all of</w:t>
+      </w:r>
+      <w:proofErr w:type="gramEnd"/>
+      <w:r>
+        <w:t xml:space="preserve"> their neighbors (as opposed to the 10-message threshold in the gossip model). Consider, for example, a node ‘a’ in the line topology, with two neighbors. One neighbor is active and has activated node ‘a’; the other neighbor is not yet active. Each round, the active neighbor has a 50% chance of sending a message to node ‘a’. Thus, node ‘a’ has an expected lifetime of 20 rounds before deactivating (10*1/p). However, in the push-sum algorithm, the odds of receiving no message for 3 rounds in a row lead to an expected lifetime of 14 rounds ([1-(1-</w:t>
+      </w:r>
+      <w:proofErr w:type="gramStart"/>
+      <w:r>
+        <w:lastRenderedPageBreak/>
+        <w:t>p)^</w:t>
+      </w:r>
+      <w:proofErr w:type="gramEnd"/>
+      <w:r>
+        <w:t>3]/[p*(1-</w:t>
+      </w:r>
+      <w:proofErr w:type="gramStart"/>
+      <w:r>
+        <w:t>p)^</w:t>
+      </w:r>
+      <w:proofErr w:type="gramEnd"/>
+      <w:r>
+        <w:t>3]). In both algorithms, the likelihood that node ‘a’ activates its other neighbor</w:t>
       </w:r>
       <w:r>
         <w:t xml:space="preserve"> at each round</w:t>
@@ -608,23 +985,10 @@
         <w:t xml:space="preserve"> in push-sum than in gossip</w:t>
       </w:r>
       <w:r>
-        <w:t xml:space="preserve">. </w:t>
-      </w:r>
-      <w:r>
-        <w:t>If such a situation occurs</w:t>
-      </w:r>
-      <w:r>
-        <w:t>, the other neighbor has no chance of activation and full convergence will never be achieved.</w:t>
-      </w:r>
-      <w:r>
-        <w:t xml:space="preserve"> </w:t>
-      </w:r>
-      <w:r>
-        <w:t xml:space="preserve">In other topologies, the probabilities become much more complicated, as nodes could have any number of active and inactive neighbors, but </w:t>
-      </w:r>
-      <w:r>
-        <w:lastRenderedPageBreak/>
-        <w:t>performance seems to suggest that push-sum is overall less likely to produce 100% convergence than gossip, especially at higher values of n.</w:t>
+        <w:t xml:space="preserve">. If such a situation occurs, the other neighbor has no chance of activation and full convergence will never be achieved. </w:t>
+      </w:r>
+      <w:r>
+        <w:t>In other topologies, the probabilities become much more complicated, as nodes could have any number of active and inactive neighbors, but performance seems to suggest that push-sum is overall less likely to produce 100% convergence than gossip, especially at higher values of n.</w:t>
       </w:r>
     </w:p>
     <w:p/>
@@ -1852,4 +2216,16 @@
     </a:ext>
   </a:extLst>
 </a:theme>
+</file>
+
+<file path=customXml/item1.xml><?xml version="1.0" encoding="utf-8"?>
+<b:Sources xmlns:b="http://schemas.openxmlformats.org/officeDocument/2006/bibliography" xmlns="http://schemas.openxmlformats.org/officeDocument/2006/bibliography" SelectedStyle="\APASixthEditionOfficeOnline.xsl" StyleName="APA" Version="6"/>
+</file>
+
+<file path=customXml/itemProps1.xml><?xml version="1.0" encoding="utf-8"?>
+<ds:datastoreItem xmlns:ds="http://schemas.openxmlformats.org/officeDocument/2006/customXml" ds:itemID="{3E19DCB8-B515-469E-9488-BD51D4252A7D}">
+  <ds:schemaRefs>
+    <ds:schemaRef ds:uri="http://schemas.openxmlformats.org/officeDocument/2006/bibliography"/>
+  </ds:schemaRefs>
+</ds:datastoreItem>
 </file>
</xml_diff>